<commit_message>
Actualizar integrantes y docente en todos los archivos
</commit_message>
<xml_diff>
--- a/Informe_Final_PC3.docx
+++ b/Informe_Final_PC3.docx
@@ -4,7 +4,7 @@
   <w:body>
     <w:p>
       <w:pPr>
-        <w:spacing w:after="240" w:before="720"/>
+        <w:spacing w:after="200" w:before="480"/>
         <w:jc w:val="center"/>
       </w:pPr>
       <w:r>
@@ -21,15 +21,15 @@
     </w:p>
     <w:p>
       <w:pPr>
-        <w:spacing w:after="120"/>
+        <w:spacing w:after="100"/>
         <w:jc w:val="center"/>
       </w:pPr>
       <w:r>
         <w:rPr>
           <w:rFonts w:ascii="Arial" w:cs="Arial" w:eastAsia="Arial" w:hAnsi="Arial"/>
           <w:color w:val="2E75B6"/>
-          <w:sz w:val="30"/>
-          <w:szCs w:val="30"/>
+          <w:sz w:val="28"/>
+          <w:szCs w:val="28"/>
         </w:rPr>
         <w:t xml:space="preserve">Proyecto PC3 – Procesamiento de Lenguaje Natural</w:t>
       </w:r>
@@ -39,7 +39,7 @@
         <w:pBdr>
           <w:bottom w:val="single" w:color="2E75B6" w:sz="8" w:space="8"/>
         </w:pBdr>
-        <w:spacing w:after="480"/>
+        <w:spacing w:after="360"/>
         <w:jc w:val="center"/>
       </w:pPr>
       <w:r>
@@ -52,7 +52,7 @@
     </w:p>
     <w:p>
       <w:pPr>
-        <w:spacing w:after="200"/>
+        <w:spacing w:after="360"/>
         <w:jc w:val="center"/>
       </w:pPr>
       <w:r>
@@ -63,84 +63,309 @@
           <w:i/>
           <w:iCs/>
           <w:color w:val="1F4E79"/>
-          <w:sz w:val="28"/>
-          <w:szCs w:val="28"/>
+          <w:sz w:val="26"/>
+          <w:szCs w:val="26"/>
         </w:rPr>
         <w:t xml:space="preserve">"Sistema Inteligente de Extracción Automática de Información Académica mediante Técnicas de Procesamiento de Lenguaje Natural"</w:t>
       </w:r>
     </w:p>
-    <w:p>
-      <w:pPr>
-        <w:spacing w:after="120" w:before="480"/>
-        <w:jc w:val="center"/>
-      </w:pPr>
-      <w:r>
-        <w:rPr>
-          <w:rFonts w:ascii="Arial" w:cs="Arial" w:eastAsia="Arial" w:hAnsi="Arial"/>
-          <w:b/>
-          <w:bCs/>
-          <w:sz w:val="22"/>
-          <w:szCs w:val="22"/>
-        </w:rPr>
-        <w:t xml:space="preserve">Curso:</w:t>
-      </w:r>
-      <w:r>
-        <w:rPr>
-          <w:rFonts w:ascii="Arial" w:cs="Arial" w:eastAsia="Arial" w:hAnsi="Arial"/>
-          <w:sz w:val="22"/>
-          <w:szCs w:val="22"/>
-        </w:rPr>
-        <w:t xml:space="preserve">  Ciencia de Datos</w:t>
-      </w:r>
-    </w:p>
-    <w:p>
-      <w:pPr>
-        <w:spacing w:after="120"/>
-        <w:jc w:val="center"/>
-      </w:pPr>
-      <w:r>
-        <w:rPr>
-          <w:rFonts w:ascii="Arial" w:cs="Arial" w:eastAsia="Arial" w:hAnsi="Arial"/>
-          <w:b/>
-          <w:bCs/>
-          <w:sz w:val="22"/>
-          <w:szCs w:val="22"/>
-        </w:rPr>
-        <w:t xml:space="preserve">Fecha de entrega:</w:t>
-      </w:r>
-      <w:r>
-        <w:rPr>
-          <w:rFonts w:ascii="Arial" w:cs="Arial" w:eastAsia="Arial" w:hAnsi="Arial"/>
-          <w:sz w:val="22"/>
-          <w:szCs w:val="22"/>
-        </w:rPr>
-        <w:t xml:space="preserve">  1 de junio de 2025</w:t>
-      </w:r>
-    </w:p>
-    <w:p>
-      <w:pPr>
-        <w:spacing w:after="120"/>
-        <w:jc w:val="center"/>
-      </w:pPr>
-      <w:r>
-        <w:rPr>
-          <w:rFonts w:ascii="Arial" w:cs="Arial" w:eastAsia="Arial" w:hAnsi="Arial"/>
-          <w:b/>
-          <w:bCs/>
-          <w:sz w:val="22"/>
-          <w:szCs w:val="22"/>
-        </w:rPr>
-        <w:t xml:space="preserve">Contexto peruano:</w:t>
-      </w:r>
-      <w:r>
-        <w:rPr>
-          <w:rFonts w:ascii="Arial" w:cs="Arial" w:eastAsia="Arial" w:hAnsi="Arial"/>
-          <w:sz w:val="22"/>
-          <w:szCs w:val="22"/>
-        </w:rPr>
-        <w:t xml:space="preserve">  Deserción universitaria en el Perú</w:t>
-      </w:r>
-    </w:p>
+    <w:tbl>
+      <w:tblPr>
+        <w:tblW w:type="dxa" w:w="9360"/>
+        <w:tblBorders>
+          <w:top w:val="single" w:color="auto" w:sz="4"/>
+          <w:left w:val="single" w:color="auto" w:sz="4"/>
+          <w:bottom w:val="single" w:color="auto" w:sz="4"/>
+          <w:right w:val="single" w:color="auto" w:sz="4"/>
+          <w:insideH w:val="single" w:color="auto" w:sz="4"/>
+          <w:insideV w:val="single" w:color="auto" w:sz="4"/>
+        </w:tblBorders>
+      </w:tblPr>
+      <w:tblGrid>
+        <w:gridCol w:w="2500"/>
+        <w:gridCol w:w="6860"/>
+      </w:tblGrid>
+      <w:tr>
+        <w:tc>
+          <w:tcPr>
+            <w:tcW w:type="dxa" w:w="2500"/>
+            <w:tcBorders>
+              <w:top w:val="single" w:color="CCCCCC" w:sz="1"/>
+              <w:left w:val="single" w:color="CCCCCC" w:sz="1"/>
+              <w:bottom w:val="single" w:color="CCCCCC" w:sz="1"/>
+              <w:right w:val="single" w:color="CCCCCC" w:sz="1"/>
+            </w:tcBorders>
+            <w:shd w:fill="1F4E79" w:val="clear"/>
+            <w:tcMar>
+              <w:top w:type="dxa" w:w="80"/>
+              <w:left w:type="dxa" w:w="120"/>
+              <w:bottom w:type="dxa" w:w="80"/>
+              <w:right w:type="dxa" w:w="120"/>
+            </w:tcMar>
+          </w:tcPr>
+          <w:p>
+            <w:r>
+              <w:rPr>
+                <w:rFonts w:ascii="Arial" w:cs="Arial" w:eastAsia="Arial" w:hAnsi="Arial"/>
+                <w:b/>
+                <w:bCs/>
+                <w:color w:val="FFFFFF"/>
+                <w:sz w:val="20"/>
+                <w:szCs w:val="20"/>
+              </w:rPr>
+              <w:t xml:space="preserve">Curso</w:t>
+            </w:r>
+          </w:p>
+        </w:tc>
+        <w:tc>
+          <w:tcPr>
+            <w:tcW w:type="dxa" w:w="6860"/>
+            <w:tcBorders>
+              <w:top w:val="single" w:color="CCCCCC" w:sz="1"/>
+              <w:left w:val="single" w:color="CCCCCC" w:sz="1"/>
+              <w:bottom w:val="single" w:color="CCCCCC" w:sz="1"/>
+              <w:right w:val="single" w:color="CCCCCC" w:sz="1"/>
+            </w:tcBorders>
+            <w:tcMar>
+              <w:top w:type="dxa" w:w="80"/>
+              <w:left w:type="dxa" w:w="120"/>
+              <w:bottom w:type="dxa" w:w="80"/>
+              <w:right w:type="dxa" w:w="120"/>
+            </w:tcMar>
+          </w:tcPr>
+          <w:p>
+            <w:r>
+              <w:rPr>
+                <w:rFonts w:ascii="Arial" w:cs="Arial" w:eastAsia="Arial" w:hAnsi="Arial"/>
+                <w:sz w:val="20"/>
+                <w:szCs w:val="20"/>
+              </w:rPr>
+              <w:t xml:space="preserve">Ciencia de Datos</w:t>
+            </w:r>
+          </w:p>
+        </w:tc>
+      </w:tr>
+      <w:tr>
+        <w:tc>
+          <w:tcPr>
+            <w:tcW w:type="dxa" w:w="2500"/>
+            <w:tcBorders>
+              <w:top w:val="single" w:color="CCCCCC" w:sz="1"/>
+              <w:left w:val="single" w:color="CCCCCC" w:sz="1"/>
+              <w:bottom w:val="single" w:color="CCCCCC" w:sz="1"/>
+              <w:right w:val="single" w:color="CCCCCC" w:sz="1"/>
+            </w:tcBorders>
+            <w:shd w:fill="1F4E79" w:val="clear"/>
+            <w:tcMar>
+              <w:top w:type="dxa" w:w="80"/>
+              <w:left w:type="dxa" w:w="120"/>
+              <w:bottom w:type="dxa" w:w="80"/>
+              <w:right w:type="dxa" w:w="120"/>
+            </w:tcMar>
+          </w:tcPr>
+          <w:p>
+            <w:r>
+              <w:rPr>
+                <w:rFonts w:ascii="Arial" w:cs="Arial" w:eastAsia="Arial" w:hAnsi="Arial"/>
+                <w:b/>
+                <w:bCs/>
+                <w:color w:val="FFFFFF"/>
+                <w:sz w:val="20"/>
+                <w:szCs w:val="20"/>
+              </w:rPr>
+              <w:t xml:space="preserve">Docente</w:t>
+            </w:r>
+          </w:p>
+        </w:tc>
+        <w:tc>
+          <w:tcPr>
+            <w:tcW w:type="dxa" w:w="6860"/>
+            <w:tcBorders>
+              <w:top w:val="single" w:color="CCCCCC" w:sz="1"/>
+              <w:left w:val="single" w:color="CCCCCC" w:sz="1"/>
+              <w:bottom w:val="single" w:color="CCCCCC" w:sz="1"/>
+              <w:right w:val="single" w:color="CCCCCC" w:sz="1"/>
+            </w:tcBorders>
+            <w:tcMar>
+              <w:top w:type="dxa" w:w="80"/>
+              <w:left w:type="dxa" w:w="120"/>
+              <w:bottom w:type="dxa" w:w="80"/>
+              <w:right w:type="dxa" w:w="120"/>
+            </w:tcMar>
+          </w:tcPr>
+          <w:p>
+            <w:r>
+              <w:rPr>
+                <w:rFonts w:ascii="Arial" w:cs="Arial" w:eastAsia="Arial" w:hAnsi="Arial"/>
+                <w:sz w:val="20"/>
+                <w:szCs w:val="20"/>
+              </w:rPr>
+              <w:t xml:space="preserve">Mg. Aldo Meza</w:t>
+            </w:r>
+          </w:p>
+        </w:tc>
+      </w:tr>
+      <w:tr>
+        <w:tc>
+          <w:tcPr>
+            <w:tcW w:type="dxa" w:w="2500"/>
+            <w:tcBorders>
+              <w:top w:val="single" w:color="CCCCCC" w:sz="1"/>
+              <w:left w:val="single" w:color="CCCCCC" w:sz="1"/>
+              <w:bottom w:val="single" w:color="CCCCCC" w:sz="1"/>
+              <w:right w:val="single" w:color="CCCCCC" w:sz="1"/>
+            </w:tcBorders>
+            <w:shd w:fill="1F4E79" w:val="clear"/>
+            <w:tcMar>
+              <w:top w:type="dxa" w:w="80"/>
+              <w:left w:type="dxa" w:w="120"/>
+              <w:bottom w:type="dxa" w:w="80"/>
+              <w:right w:type="dxa" w:w="120"/>
+            </w:tcMar>
+          </w:tcPr>
+          <w:p>
+            <w:r>
+              <w:rPr>
+                <w:rFonts w:ascii="Arial" w:cs="Arial" w:eastAsia="Arial" w:hAnsi="Arial"/>
+                <w:b/>
+                <w:bCs/>
+                <w:color w:val="FFFFFF"/>
+                <w:sz w:val="20"/>
+                <w:szCs w:val="20"/>
+              </w:rPr>
+              <w:t xml:space="preserve">Fecha de entrega</w:t>
+            </w:r>
+          </w:p>
+        </w:tc>
+        <w:tc>
+          <w:tcPr>
+            <w:tcW w:type="dxa" w:w="6860"/>
+            <w:tcBorders>
+              <w:top w:val="single" w:color="CCCCCC" w:sz="1"/>
+              <w:left w:val="single" w:color="CCCCCC" w:sz="1"/>
+              <w:bottom w:val="single" w:color="CCCCCC" w:sz="1"/>
+              <w:right w:val="single" w:color="CCCCCC" w:sz="1"/>
+            </w:tcBorders>
+            <w:tcMar>
+              <w:top w:type="dxa" w:w="80"/>
+              <w:left w:type="dxa" w:w="120"/>
+              <w:bottom w:type="dxa" w:w="80"/>
+              <w:right w:type="dxa" w:w="120"/>
+            </w:tcMar>
+          </w:tcPr>
+          <w:p>
+            <w:r>
+              <w:rPr>
+                <w:rFonts w:ascii="Arial" w:cs="Arial" w:eastAsia="Arial" w:hAnsi="Arial"/>
+                <w:sz w:val="20"/>
+                <w:szCs w:val="20"/>
+              </w:rPr>
+              <w:t xml:space="preserve">Mayo 2026</w:t>
+            </w:r>
+          </w:p>
+        </w:tc>
+      </w:tr>
+      <w:tr>
+        <w:tc>
+          <w:tcPr>
+            <w:tcW w:type="dxa" w:w="2500"/>
+            <w:tcBorders>
+              <w:top w:val="single" w:color="CCCCCC" w:sz="1"/>
+              <w:left w:val="single" w:color="CCCCCC" w:sz="1"/>
+              <w:bottom w:val="single" w:color="CCCCCC" w:sz="1"/>
+              <w:right w:val="single" w:color="CCCCCC" w:sz="1"/>
+            </w:tcBorders>
+            <w:shd w:fill="1F4E79" w:val="clear"/>
+            <w:tcMar>
+              <w:top w:type="dxa" w:w="80"/>
+              <w:left w:type="dxa" w:w="120"/>
+              <w:bottom w:type="dxa" w:w="80"/>
+              <w:right w:type="dxa" w:w="120"/>
+            </w:tcMar>
+          </w:tcPr>
+          <w:p>
+            <w:r>
+              <w:rPr>
+                <w:rFonts w:ascii="Arial" w:cs="Arial" w:eastAsia="Arial" w:hAnsi="Arial"/>
+                <w:b/>
+                <w:bCs/>
+                <w:color w:val="FFFFFF"/>
+                <w:sz w:val="20"/>
+                <w:szCs w:val="20"/>
+              </w:rPr>
+              <w:t xml:space="preserve">Integrantes</w:t>
+            </w:r>
+          </w:p>
+        </w:tc>
+        <w:tc>
+          <w:tcPr>
+            <w:tcW w:type="dxa" w:w="6860"/>
+            <w:tcBorders>
+              <w:top w:val="single" w:color="CCCCCC" w:sz="1"/>
+              <w:left w:val="single" w:color="CCCCCC" w:sz="1"/>
+              <w:bottom w:val="single" w:color="CCCCCC" w:sz="1"/>
+              <w:right w:val="single" w:color="CCCCCC" w:sz="1"/>
+            </w:tcBorders>
+            <w:tcMar>
+              <w:top w:type="dxa" w:w="80"/>
+              <w:left w:type="dxa" w:w="120"/>
+              <w:bottom w:type="dxa" w:w="80"/>
+              <w:right w:type="dxa" w:w="120"/>
+            </w:tcMar>
+          </w:tcPr>
+          <w:p>
+            <w:r>
+              <w:rPr>
+                <w:rFonts w:ascii="Arial" w:cs="Arial" w:eastAsia="Arial" w:hAnsi="Arial"/>
+                <w:sz w:val="20"/>
+                <w:szCs w:val="20"/>
+              </w:rPr>
+              <w:t xml:space="preserve">Geronimo Ccoillor, Fernando</w:t>
+            </w:r>
+          </w:p>
+          <w:p>
+            <w:r>
+              <w:rPr>
+                <w:rFonts w:ascii="Arial" w:cs="Arial" w:eastAsia="Arial" w:hAnsi="Arial"/>
+                <w:sz w:val="20"/>
+                <w:szCs w:val="20"/>
+              </w:rPr>
+              <w:t xml:space="preserve">Morales Morales, Flavio Oscar</w:t>
+            </w:r>
+          </w:p>
+          <w:p>
+            <w:r>
+              <w:rPr>
+                <w:rFonts w:ascii="Arial" w:cs="Arial" w:eastAsia="Arial" w:hAnsi="Arial"/>
+                <w:sz w:val="20"/>
+                <w:szCs w:val="20"/>
+              </w:rPr>
+              <w:t xml:space="preserve">Nolasco Palomino, Josselyn Nayeli</w:t>
+            </w:r>
+          </w:p>
+          <w:p>
+            <w:r>
+              <w:rPr>
+                <w:rFonts w:ascii="Arial" w:cs="Arial" w:eastAsia="Arial" w:hAnsi="Arial"/>
+                <w:sz w:val="20"/>
+                <w:szCs w:val="20"/>
+              </w:rPr>
+              <w:t xml:space="preserve">Vargas Estela, Kopeycor</w:t>
+            </w:r>
+          </w:p>
+          <w:p>
+            <w:r>
+              <w:rPr>
+                <w:rFonts w:ascii="Arial" w:cs="Arial" w:eastAsia="Arial" w:hAnsi="Arial"/>
+                <w:sz w:val="20"/>
+                <w:szCs w:val="20"/>
+              </w:rPr>
+              <w:t xml:space="preserve">Yucra Paredes, Carmen Rosa</w:t>
+            </w:r>
+          </w:p>
+        </w:tc>
+      </w:tr>
+    </w:tbl>
     <w:p>
       <w:pPr>
         <w:pageBreakBefore/>
@@ -347,20 +572,6 @@
           <w:szCs w:val="22"/>
         </w:rPr>
         <w:t xml:space="preserve">Descubrir los temas latentes presentes en el corpus.</w:t>
-      </w:r>
-    </w:p>
-    <w:p>
-      <w:pPr>
-        <w:spacing w:after="120" w:line="276"/>
-        <w:jc w:val="both"/>
-      </w:pPr>
-      <w:r>
-        <w:rPr>
-          <w:rFonts w:ascii="Arial" w:cs="Arial" w:eastAsia="Arial" w:hAnsi="Arial"/>
-          <w:sz w:val="22"/>
-          <w:szCs w:val="22"/>
-        </w:rPr>
-        <w:t xml:space="preserve">Este proyecto resuelve dicha problemática mediante la automatización del análisis textual con herramientas modernas de PLN.</w:t>
       </w:r>
     </w:p>
     <w:p>
@@ -1552,7 +1763,7 @@
           <w:sz w:val="22"/>
           <w:szCs w:val="22"/>
         </w:rPr>
-        <w:t xml:space="preserve">Se utilizó el modelo es_core_news_sm de spaCy para identificar automáticamente entidades nombradas en el texto. El modelo clasifica las entidades en cuatro categorías: PER (personas/autores), ORG (organizaciones/instituciones), LOC (lugares geográficos) y MISC (entidades misceláneas). Esta técnica permite extraer automáticamente los actores y organizaciones clave del documento académico sin necesidad de búsquedas manuales.</w:t>
+        <w:t xml:space="preserve">Se utilizó el modelo es_core_news_sm de spaCy para identificar automáticamente entidades nombradas en el texto. El modelo clasifica las entidades en cuatro categorías: PER (personas/autores), ORG (organizaciones/instituciones), LOC (lugares geográficos) y MISC (entidades misceláneas).</w:t>
       </w:r>
     </w:p>
     <w:p>
@@ -1583,7 +1794,7 @@
           <w:sz w:val="22"/>
           <w:szCs w:val="22"/>
         </w:rPr>
-        <w:t xml:space="preserve">TF-IDF es una métrica estadística que evalúa la importancia de un término en relación con el corpus. Combina la frecuencia del término en el documento (TF) con la inversa de la frecuencia de documentos que lo contienen (IDF). Se implementó con TfidfVectorizer de scikit-learn, extrayendo unigramas y bigramas. Los términos con mayor puntaje representan los conceptos centrales del artículo analizado.</w:t>
+        <w:t xml:space="preserve">TF-IDF es una métrica estadística que evalúa la importancia de un término en relación con el corpus. Se implementó con TfidfVectorizer de scikit-learn, extrayendo unigramas y bigramas. Los términos con mayor puntaje representan los conceptos centrales del artículo analizado.</w:t>
       </w:r>
     </w:p>
     <w:p>
@@ -1614,7 +1825,7 @@
           <w:sz w:val="22"/>
           <w:szCs w:val="22"/>
         </w:rPr>
-        <w:t xml:space="preserve">Se aplicó TextBlob para evaluar la polaridad (rango -1 a +1) y subjetividad (rango 0 a 1) de cada segmento del documento. La polaridad indica si el texto es positivo, negativo o neutro. Esta técnica permite conocer el tono general del artículo académico: si predominan afirmaciones positivas (soluciones encontradas), negativas (descripción de problemas) o neutras (descripción de metodología).</w:t>
+        <w:t xml:space="preserve">Se aplicó TextBlob para evaluar la polaridad (rango -1 a +1) y subjetividad (rango 0 a 1) de cada segmento del documento. Permite conocer el tono general del artículo académico.</w:t>
       </w:r>
     </w:p>
     <w:p>
@@ -1645,7 +1856,7 @@
           <w:sz w:val="22"/>
           <w:szCs w:val="22"/>
         </w:rPr>
-        <w:t xml:space="preserve">La nube de palabras es una técnica de visualización en la que el tamaño de cada palabra es proporcional a su frecuencia en el texto preprocesado. Se generó usando la librería wordcloud, aplicada sobre el texto ya limpio y lematizado. Permite identificar visualmente los conceptos dominantes del documento de manera intuitiva.</w:t>
+        <w:t xml:space="preserve">La nube de palabras es una técnica de visualización en la que el tamaño de cada palabra es proporcional a su frecuencia en el texto preprocesado, generada con la librería wordcloud.</w:t>
       </w:r>
     </w:p>
     <w:p>
@@ -1676,7 +1887,7 @@
           <w:sz w:val="22"/>
           <w:szCs w:val="22"/>
         </w:rPr>
-        <w:t xml:space="preserve">El modelo LDA (Latent Dirichlet Allocation) es un algoritmo de aprendizaje no supervisado que descubre temas latentes en una colección de textos. Cada tema es representado por un conjunto de palabras con alta probabilidad de co-ocurrencia. Se configuró el modelo para identificar 4 temas latentes en el documento, proporcionando una visión estructurada de los subtemas tratados en el artículo.</w:t>
+        <w:t xml:space="preserve">El modelo LDA descubre temas latentes en el texto. Se configuró para identificar 4 temas latentes, representados por conjuntos de palabras con alta probabilidad de co-ocurrencia.</w:t>
       </w:r>
     </w:p>
     <w:p>
@@ -1707,7 +1918,7 @@
           <w:sz w:val="22"/>
           <w:szCs w:val="22"/>
         </w:rPr>
-        <w:t xml:space="preserve">Mediante expresiones regulares se detectan y extraen las secciones estructurales del documento: Resumen, Abstract, Introducción, Metodología, Resultados y Conclusiones. Esta técnica combina el conocimiento del dominio (estructura de artículos científicos) con el procesamiento de texto para segmentar automáticamente el contenido.</w:t>
+        <w:t xml:space="preserve">Mediante expresiones regulares se detectan y extraen las secciones estructurales del documento: Resumen, Abstract, Introducción, Metodología, Resultados y Conclusiones.</w:t>
       </w:r>
     </w:p>
     <w:p>
@@ -1741,7 +1952,7 @@
           <w:sz w:val="22"/>
           <w:szCs w:val="22"/>
         </w:rPr>
-        <w:t xml:space="preserve">La aplicación procesó el artículo académico "Deserción Universitaria" de Dialnet y obtuvo los siguientes resultados principales:</w:t>
+        <w:t xml:space="preserve">La aplicación procesó el artículo académico "Deserción Universitaria" de Dialnet y obtuvo resultados relevantes en cada técnica aplicada.</w:t>
       </w:r>
     </w:p>
     <w:p>
@@ -1758,7 +1969,7 @@
           <w:sz w:val="26"/>
           <w:szCs w:val="26"/>
         </w:rPr>
-        <w:t xml:space="preserve">6.1 Extracción de Texto</w:t>
+        <w:t xml:space="preserve">6.1 NER</w:t>
       </w:r>
     </w:p>
     <w:p>
@@ -1772,7 +1983,7 @@
           <w:sz w:val="22"/>
           <w:szCs w:val="22"/>
         </w:rPr>
-        <w:t xml:space="preserve">El sistema extrajo exitosamente el contenido completo del documento PDF. El texto fue procesado página a página mediante pdfplumber, generando una variable de texto consolidada que sirvió de entrada para todas las técnicas PLN posteriores.</w:t>
+        <w:t xml:space="preserve">Detectó autores, universidades e instituciones peruanas (MINEDU, SUNEDU) y referencias geográficas.</w:t>
       </w:r>
     </w:p>
     <w:p>
@@ -1789,7 +2000,7 @@
           <w:sz w:val="26"/>
           <w:szCs w:val="26"/>
         </w:rPr>
-        <w:t xml:space="preserve">6.2 Entidades Nombradas (NER)</w:t>
+        <w:t xml:space="preserve">6.2 TF-IDF</w:t>
       </w:r>
     </w:p>
     <w:p>
@@ -1803,7 +2014,7 @@
           <w:sz w:val="22"/>
           <w:szCs w:val="22"/>
         </w:rPr>
-        <w:t xml:space="preserve">El modelo NER de spaCy detectó múltiples entidades en el documento: autores e investigadores citados (tipo PER), universidades e instituciones peruanas (tipo ORG) como el MINEDU y universidades nacionales, así como referencias geográficas a regiones del Perú (tipo LOC). La visualización de barras mostró que las entidades de tipo ORG son las más frecuentes, lo cual es coherente con un artículo académico sobre educación superior.</w:t>
+        <w:t xml:space="preserve">Top términos: "deserción", "universitaria", "estudiantes", "factores", "académico" y bigramas como "deserción universitaria" y "educación superior".</w:t>
       </w:r>
     </w:p>
     <w:p>
@@ -1820,7 +2031,7 @@
           <w:sz w:val="26"/>
           <w:szCs w:val="26"/>
         </w:rPr>
-        <w:t xml:space="preserve">6.3 TF-IDF</w:t>
+        <w:t xml:space="preserve">6.3 Análisis de Sentimiento</w:t>
       </w:r>
     </w:p>
     <w:p>
@@ -1834,7 +2045,7 @@
           <w:sz w:val="22"/>
           <w:szCs w:val="22"/>
         </w:rPr>
-        <w:t xml:space="preserve">Los términos con mayor puntaje TF-IDF incluyeron conceptos directamente relacionados con la problemática: "deserción", "universitaria", "estudiantes", "factores", "académico", entre otros. Los bigramas más relevantes fueron "deserción universitaria" y "educación superior", confirmando que el algoritmo identifica correctamente los conceptos centrales del artículo.</w:t>
+        <w:t xml:space="preserve">Predominio de segmentos neutros (coherente con textos académicos objetivos). Segmentos positivos en conclusiones y negativos en descripción del problema.</w:t>
       </w:r>
     </w:p>
     <w:p>
@@ -1851,7 +2062,7 @@
           <w:sz w:val="26"/>
           <w:szCs w:val="26"/>
         </w:rPr>
-        <w:t xml:space="preserve">6.4 Análisis de Sentimiento</w:t>
+        <w:t xml:space="preserve">6.4 Topic Modeling LDA</w:t>
       </w:r>
     </w:p>
     <w:p>
@@ -1865,38 +2076,7 @@
           <w:sz w:val="22"/>
           <w:szCs w:val="22"/>
         </w:rPr>
-        <w:t xml:space="preserve">El análisis de sentimiento reveló que el documento tiene un predominio de segmentos con sentimiento neutro, lo cual es esperable en textos académicos formales que priorizan la objetividad. Se identificaron algunos segmentos con polaridad positiva (conclusiones y propuestas de solución) y negativos (descripción del problema y sus consecuencias), lo que refleja la estructura argumentativa del artículo.</w:t>
-      </w:r>
-    </w:p>
-    <w:p>
-      <w:pPr>
-        <w:pStyle w:val="Heading2"/>
-        <w:spacing w:after="120" w:before="240"/>
-      </w:pPr>
-      <w:r>
-        <w:rPr>
-          <w:rFonts w:ascii="Arial" w:cs="Arial" w:eastAsia="Arial" w:hAnsi="Arial"/>
-          <w:b/>
-          <w:bCs/>
-          <w:color w:val="2E75B6"/>
-          <w:sz w:val="26"/>
-          <w:szCs w:val="26"/>
-        </w:rPr>
-        <w:t xml:space="preserve">6.5 Topic Modeling LDA</w:t>
-      </w:r>
-    </w:p>
-    <w:p>
-      <w:pPr>
-        <w:spacing w:after="120" w:line="276"/>
-        <w:jc w:val="both"/>
-      </w:pPr>
-      <w:r>
-        <w:rPr>
-          <w:rFonts w:ascii="Arial" w:cs="Arial" w:eastAsia="Arial" w:hAnsi="Arial"/>
-          <w:sz w:val="22"/>
-          <w:szCs w:val="22"/>
-        </w:rPr>
-        <w:t xml:space="preserve">LDA identificó 4 temas latentes en el documento. Los temas descubiertos incluyeron grupos de palabras relacionados con: (1) factores socioeconómicos de la deserción, (2) rendimiento académico y evaluación, (3) políticas institucionales y retención estudiantil, y (4) metodología de investigación. Esta segmentación temática es coherente con la estructura típica de artículos sobre deserción universitaria.</w:t>
+        <w:t xml:space="preserve">4 temas: (1) factores socioeconómicos, (2) rendimiento académico, (3) políticas institucionales y retención estudiantil, (4) metodología de investigación.</w:t>
       </w:r>
     </w:p>
     <w:p>
@@ -1930,7 +2110,27 @@
           <w:sz w:val="22"/>
           <w:szCs w:val="22"/>
         </w:rPr>
-        <w:t xml:space="preserve">Se desarrolló una aplicación web interactiva con Streamlit que integra todas las técnicas PLN en una interfaz amigable. La aplicación está organizada en siete pestañas:</w:t>
+        <w:t xml:space="preserve">Se desarrolló una aplicación web interactiva organizada en siete pestañas: Resumen general, Entidades NER, TF-IDF y WordCloud, Análisis de Sentimiento, Topic Modeling, Secciones académicas y Texto extraído. Cada pestaña incluye botones de descarga en formato CSV.</w:t>
+      </w:r>
+    </w:p>
+    <w:p>
+      <w:pPr>
+        <w:pStyle w:val="Heading1"/>
+        <w:pBdr>
+          <w:bottom w:val="single" w:color="2E75B6" w:sz="6" w:space="4"/>
+        </w:pBdr>
+        <w:spacing w:after="180" w:before="360"/>
+      </w:pPr>
+      <w:r>
+        <w:rPr>
+          <w:rFonts w:ascii="Arial" w:cs="Arial" w:eastAsia="Arial" w:hAnsi="Arial"/>
+          <w:b/>
+          <w:bCs/>
+          <w:color w:val="1F4E79"/>
+          <w:sz w:val="32"/>
+          <w:szCs w:val="32"/>
+        </w:rPr>
+        <w:t xml:space="preserve">8. Conclusiones</w:t>
       </w:r>
     </w:p>
     <w:p>
@@ -1948,7 +2148,7 @@
           <w:sz w:val="22"/>
           <w:szCs w:val="22"/>
         </w:rPr>
-        <w:t xml:space="preserve">Resumen general: métricas principales y tabla consolidada de resultados.</w:t>
+        <w:t xml:space="preserve">La combinación de 6 técnicas PLN permite una visión multidimensional del documento académico.</w:t>
       </w:r>
     </w:p>
     <w:p>
@@ -1966,7 +2166,7 @@
           <w:sz w:val="22"/>
           <w:szCs w:val="22"/>
         </w:rPr>
-        <w:t xml:space="preserve">Entidades NER: tabla filtrable por tipo y gráfico de distribución.</w:t>
+        <w:t xml:space="preserve">spaCy con es_core_news_sm resulta efectivo para identificar entidades en textos académicos en español.</w:t>
       </w:r>
     </w:p>
     <w:p>
@@ -1984,7 +2184,7 @@
           <w:sz w:val="22"/>
           <w:szCs w:val="22"/>
         </w:rPr>
-        <w:t xml:space="preserve">TF-IDF y WordCloud: tabla de términos relevantes, gráfico de barras y nube de palabras.</w:t>
+        <w:t xml:space="preserve">TF-IDF identifica correctamente los conceptos centrales del artículo sin requerir anotación manual.</w:t>
       </w:r>
     </w:p>
     <w:p>
@@ -2002,7 +2202,7 @@
           <w:sz w:val="22"/>
           <w:szCs w:val="22"/>
         </w:rPr>
-        <w:t xml:space="preserve">Sentimiento: métricas de distribución, gráfico de polaridad por segmento y tabla detallada.</w:t>
+        <w:t xml:space="preserve">El análisis de sentimiento confirma el tono neutro-objetivo de los textos académicos formales.</w:t>
       </w:r>
     </w:p>
     <w:p>
@@ -2020,7 +2220,7 @@
           <w:sz w:val="22"/>
           <w:szCs w:val="22"/>
         </w:rPr>
-        <w:t xml:space="preserve">Topic Modeling: tabla de temas LDA con palabras clave por tema.</w:t>
+        <w:t xml:space="preserve">LDA proporcionó una segmentación temática coherente de manera no supervisada.</w:t>
       </w:r>
     </w:p>
     <w:p>
@@ -2038,39 +2238,7 @@
           <w:sz w:val="22"/>
           <w:szCs w:val="22"/>
         </w:rPr>
-        <w:t xml:space="preserve">Secciones: visualización de las secciones académicas detectadas.</w:t>
-      </w:r>
-    </w:p>
-    <w:p>
-      <w:pPr>
-        <w:pStyle w:val="ListParagraph"/>
-        <w:numPr>
-          <w:ilvl w:val="0"/>
-          <w:numId w:val="1"/>
-        </w:numPr>
-        <w:spacing w:after="80"/>
-      </w:pPr>
-      <w:r>
-        <w:rPr>
-          <w:rFonts w:ascii="Arial" w:cs="Arial" w:eastAsia="Arial" w:hAnsi="Arial"/>
-          <w:sz w:val="22"/>
-          <w:szCs w:val="22"/>
-        </w:rPr>
-        <w:t xml:space="preserve">Texto extraído: visualización del contenido completo del PDF procesado.</w:t>
-      </w:r>
-    </w:p>
-    <w:p>
-      <w:pPr>
-        <w:spacing w:after="120" w:line="276"/>
-        <w:jc w:val="both"/>
-      </w:pPr>
-      <w:r>
-        <w:rPr>
-          <w:rFonts w:ascii="Arial" w:cs="Arial" w:eastAsia="Arial" w:hAnsi="Arial"/>
-          <w:sz w:val="22"/>
-          <w:szCs w:val="22"/>
-        </w:rPr>
-        <w:t xml:space="preserve">Cada pestaña incluye botones de descarga en formato CSV, permitiendo al usuario exportar todos los resultados para análisis posterior.</w:t>
+        <w:t xml:space="preserve">La interfaz Streamlit democratiza el acceso a herramientas de PLN sin requerir conocimientos técnicos.</w:t>
       </w:r>
     </w:p>
     <w:p>
@@ -2090,7 +2258,7 @@
           <w:sz w:val="32"/>
           <w:szCs w:val="32"/>
         </w:rPr>
-        <w:t xml:space="preserve">8. Conclusiones</w:t>
+        <w:t xml:space="preserve">9. Referencias</w:t>
       </w:r>
     </w:p>
     <w:p>
@@ -2104,135 +2272,7 @@
           <w:sz w:val="22"/>
           <w:szCs w:val="22"/>
         </w:rPr>
-        <w:t xml:space="preserve">El sistema desarrollado demuestra la viabilidad de aplicar técnicas de Procesamiento de Lenguaje Natural para automatizar la extracción y análisis de información académica en el contexto educativo peruano.</w:t>
-      </w:r>
-    </w:p>
-    <w:p>
-      <w:pPr>
-        <w:pStyle w:val="ListParagraph"/>
-        <w:numPr>
-          <w:ilvl w:val="0"/>
-          <w:numId w:val="1"/>
-        </w:numPr>
-        <w:spacing w:after="80"/>
-      </w:pPr>
-      <w:r>
-        <w:rPr>
-          <w:rFonts w:ascii="Arial" w:cs="Arial" w:eastAsia="Arial" w:hAnsi="Arial"/>
-          <w:sz w:val="22"/>
-          <w:szCs w:val="22"/>
-        </w:rPr>
-        <w:t xml:space="preserve">La combinación de seis técnicas PLN (NER, TF-IDF, Análisis de Sentimiento, WordCloud, LDA y extracción de secciones) permite obtener una visión multidimensional del documento académico.</w:t>
-      </w:r>
-    </w:p>
-    <w:p>
-      <w:pPr>
-        <w:pStyle w:val="ListParagraph"/>
-        <w:numPr>
-          <w:ilvl w:val="0"/>
-          <w:numId w:val="1"/>
-        </w:numPr>
-        <w:spacing w:after="80"/>
-      </w:pPr>
-      <w:r>
-        <w:rPr>
-          <w:rFonts w:ascii="Arial" w:cs="Arial" w:eastAsia="Arial" w:hAnsi="Arial"/>
-          <w:sz w:val="22"/>
-          <w:szCs w:val="22"/>
-        </w:rPr>
-        <w:t xml:space="preserve">spaCy con el modelo es_core_news_sm resulta efectivo para identificar entidades en textos académicos en español, aunque su precisión mejora con textos formales y bien estructurados.</w:t>
-      </w:r>
-    </w:p>
-    <w:p>
-      <w:pPr>
-        <w:pStyle w:val="ListParagraph"/>
-        <w:numPr>
-          <w:ilvl w:val="0"/>
-          <w:numId w:val="1"/>
-        </w:numPr>
-        <w:spacing w:after="80"/>
-      </w:pPr>
-      <w:r>
-        <w:rPr>
-          <w:rFonts w:ascii="Arial" w:cs="Arial" w:eastAsia="Arial" w:hAnsi="Arial"/>
-          <w:sz w:val="22"/>
-          <w:szCs w:val="22"/>
-        </w:rPr>
-        <w:t xml:space="preserve">TF-IDF demostró ser una técnica robusta para identificar los conceptos centrales del artículo, superando limitaciones de frecuencia bruta al ponderar la relevancia relativa de cada término.</w:t>
-      </w:r>
-    </w:p>
-    <w:p>
-      <w:pPr>
-        <w:pStyle w:val="ListParagraph"/>
-        <w:numPr>
-          <w:ilvl w:val="0"/>
-          <w:numId w:val="1"/>
-        </w:numPr>
-        <w:spacing w:after="80"/>
-      </w:pPr>
-      <w:r>
-        <w:rPr>
-          <w:rFonts w:ascii="Arial" w:cs="Arial" w:eastAsia="Arial" w:hAnsi="Arial"/>
-          <w:sz w:val="22"/>
-          <w:szCs w:val="22"/>
-        </w:rPr>
-        <w:t xml:space="preserve">El análisis de sentimiento con TextBlob confirma el tono predominantemente neutro-objetivo de los textos académicos, con variaciones según la sección del artículo.</w:t>
-      </w:r>
-    </w:p>
-    <w:p>
-      <w:pPr>
-        <w:pStyle w:val="ListParagraph"/>
-        <w:numPr>
-          <w:ilvl w:val="0"/>
-          <w:numId w:val="1"/>
-        </w:numPr>
-        <w:spacing w:after="80"/>
-      </w:pPr>
-      <w:r>
-        <w:rPr>
-          <w:rFonts w:ascii="Arial" w:cs="Arial" w:eastAsia="Arial" w:hAnsi="Arial"/>
-          <w:sz w:val="22"/>
-          <w:szCs w:val="22"/>
-        </w:rPr>
-        <w:t xml:space="preserve">LDA proporcionó una segmentación temática coherente, identificando los subtemas principales del artículo de manera no supervisada.</w:t>
-      </w:r>
-    </w:p>
-    <w:p>
-      <w:pPr>
-        <w:pStyle w:val="ListParagraph"/>
-        <w:numPr>
-          <w:ilvl w:val="0"/>
-          <w:numId w:val="1"/>
-        </w:numPr>
-        <w:spacing w:after="80"/>
-      </w:pPr>
-      <w:r>
-        <w:rPr>
-          <w:rFonts w:ascii="Arial" w:cs="Arial" w:eastAsia="Arial" w:hAnsi="Arial"/>
-          <w:sz w:val="22"/>
-          <w:szCs w:val="22"/>
-        </w:rPr>
-        <w:t xml:space="preserve">La interfaz Streamlit permite democratizar el acceso a estas herramientas de PLN, sin requerir conocimientos técnicos del usuario final.</w:t>
-      </w:r>
-    </w:p>
-    <w:p>
-      <w:pPr>
-        <w:pStyle w:val="Heading1"/>
-        <w:pBdr>
-          <w:bottom w:val="single" w:color="2E75B6" w:sz="6" w:space="4"/>
-        </w:pBdr>
-        <w:spacing w:after="180" w:before="360"/>
-      </w:pPr>
-      <w:r>
-        <w:rPr>
-          <w:rFonts w:ascii="Arial" w:cs="Arial" w:eastAsia="Arial" w:hAnsi="Arial"/>
-          <w:b/>
-          <w:bCs/>
-          <w:color w:val="1F4E79"/>
-          <w:sz w:val="32"/>
-          <w:szCs w:val="32"/>
-        </w:rPr>
-        <w:t xml:space="preserve">9. Referencias</w:t>
+        <w:t xml:space="preserve">Dialnet. (2024). Deserción Universitaria en el Perú. Recuperado de https://dialnet.unirioja.es</w:t>
       </w:r>
     </w:p>
     <w:p>
@@ -2246,7 +2286,7 @@
           <w:sz w:val="22"/>
           <w:szCs w:val="22"/>
         </w:rPr>
-        <w:t xml:space="preserve">Dialnet. (2024). Deserción Universitaria en el Perú. Recuperado de https://dialnet.unirioja.es</w:t>
+        <w:t xml:space="preserve">Honnibal, M., &amp; Montani, I. (2017). spaCy 2: Natural language understanding with Bloom embeddings, convolutional neural networks and incremental parsing.</w:t>
       </w:r>
     </w:p>
     <w:p>
@@ -2260,7 +2300,7 @@
           <w:sz w:val="22"/>
           <w:szCs w:val="22"/>
         </w:rPr>
-        <w:t xml:space="preserve">Honnibal, M., &amp; Montani, I. (2017). spaCy 2: Natural language understanding with Bloom embeddings, convolutional neural networks and incremental parsing.</w:t>
+        <w:t xml:space="preserve">Loria, S. (2018). TextBlob Documentation. Release 0.15.2.</w:t>
       </w:r>
     </w:p>
     <w:p>
@@ -2274,7 +2314,7 @@
           <w:sz w:val="22"/>
           <w:szCs w:val="22"/>
         </w:rPr>
-        <w:t xml:space="preserve">Loria, S. (2018). TextBlob Documentation. Release 0.15.2.</w:t>
+        <w:t xml:space="preserve">Pedregosa, F., et al. (2011). Scikit-learn: Machine learning in Python. Journal of Machine Learning Research, 12, 2825-2830.</w:t>
       </w:r>
     </w:p>
     <w:p>
@@ -2288,35 +2328,7 @@
           <w:sz w:val="22"/>
           <w:szCs w:val="22"/>
         </w:rPr>
-        <w:t xml:space="preserve">Pedregosa, F., et al. (2011). Scikit-learn: Machine learning in Python. Journal of Machine Learning Research, 12, 2825-2830.</w:t>
-      </w:r>
-    </w:p>
-    <w:p>
-      <w:pPr>
-        <w:spacing w:after="120" w:line="276"/>
-        <w:jc w:val="both"/>
-      </w:pPr>
-      <w:r>
-        <w:rPr>
-          <w:rFonts w:ascii="Arial" w:cs="Arial" w:eastAsia="Arial" w:hAnsi="Arial"/>
-          <w:sz w:val="22"/>
-          <w:szCs w:val="22"/>
-        </w:rPr>
         <w:t xml:space="preserve">Blei, D. M., Ng, A. Y., &amp; Jordan, M. I. (2003). Latent Dirichlet Allocation. Journal of Machine Learning Research, 3, 993-1022.</w:t>
-      </w:r>
-    </w:p>
-    <w:p>
-      <w:pPr>
-        <w:spacing w:after="120" w:line="276"/>
-        <w:jc w:val="both"/>
-      </w:pPr>
-      <w:r>
-        <w:rPr>
-          <w:rFonts w:ascii="Arial" w:cs="Arial" w:eastAsia="Arial" w:hAnsi="Arial"/>
-          <w:sz w:val="22"/>
-          <w:szCs w:val="22"/>
-        </w:rPr>
-        <w:t xml:space="preserve">Bird, S., Klein, E., &amp; Loper, E. (2009). Natural Language Processing with Python. O'Reilly Media.</w:t>
       </w:r>
     </w:p>
     <w:p>

</xml_diff>